<commit_message>
correct line breaks before headings, list items, etc
</commit_message>
<xml_diff>
--- a/example/result/simple.docx
+++ b/example/result/simple.docx
@@ -26,7 +26,7 @@
         <w:t>Sub heading of example</w:t>
       </w:r>
       <w:r>
-        <w:t xml:space="preserve"> where add_text adds text to the sub heading.</w:t>
+        <w:t xml:space="preserve"> where add_text adds text to the sub heading</w:t>
       </w:r>
     </w:p>
     <w:p>
@@ -55,13 +55,13 @@
         <w:pStyle w:val="Heading2"/>
       </w:pPr>
       <w:r>
-        <w:t>The example is</w:t>
+        <w:t>Heading with URL to</w:t>
       </w:r>
       <w:r>
         <w:t xml:space="preserve"> </w:t>
       </w:r>
       <w:r>
-        <w:t>here</w:t>
+        <w:t>the example file</w:t>
       </w:r>
     </w:p>
     <w:p>
@@ -84,7 +84,7 @@
         <w:t xml:space="preserve"> </w:t>
       </w:r>
       <w:r>
-        <w:t>here</w:t>
+        <w:t>The same example file</w:t>
       </w:r>
     </w:p>
     <w:p>
@@ -256,7 +256,7 @@
               <w:rPr>
                 <w:b/>
               </w:rPr>
-              <w:t>Name</w:t>
+              <w:t>Full Name</w:t>
             </w:r>
           </w:p>
         </w:tc>
@@ -269,7 +269,7 @@
               <w:rPr>
                 <w:b/>
               </w:rPr>
-              <w:t>Street</w:t>
+              <w:t>Street and Number</w:t>
             </w:r>
           </w:p>
         </w:tc>
@@ -282,7 +282,7 @@
               <w:rPr>
                 <w:b/>
               </w:rPr>
-              <w:t>City</w:t>
+              <w:t>City or Town</w:t>
             </w:r>
           </w:p>
         </w:tc>

</xml_diff>